<commit_message>
docs: record verified deployment and publish the live user guides
</commit_message>
<xml_diff>
--- a/agent-canvas/output/docx/Agent-Canvas-Quick-Guide.docx
+++ b/agent-canvas/output/docx/Agent-Canvas-Quick-Guide.docx
@@ -503,7 +503,7 @@
         <w:rPr>
           <w:b w:val="0"/>
         </w:rPr>
-        <w:t xml:space="preserve"> and wait for the result. Emails remain drafts. Changes to customer records require a preview and your approval in </w:t>
+        <w:t xml:space="preserve"> and wait for the result. Emails remain drafts. The real HubSpot account is read-only. Changes in the practice account require a preview and approval in </w:t>
       </w:r>
       <w:r>
         <w:rPr>
@@ -515,7 +515,7 @@
         <w:rPr>
           <w:b w:val="0"/>
         </w:rPr>
-        <w:t xml:space="preserve"> before they are applied.</w:t>
+        <w:t>.</w:t>
       </w:r>
     </w:p>
     <w:p>
@@ -1496,7 +1496,7 @@
       <w:rPr>
         <w:sz w:val="17"/>
       </w:rPr>
-      <w:t>CTG  |  Simplified local preview  |  September 2026</w:t>
+      <w:t>CTG  |  CTG team guide  |  September 2026</w:t>
       <w:tab/>
     </w:r>
     <w:fldSimple w:instr="PAGE"/>

</xml_diff>